<commit_message>
Correct tenure groups, claims and wording
</commit_message>
<xml_diff>
--- a/ZohraSayyed_ProjectReport.docx
+++ b/ZohraSayyed_ProjectReport.docx
@@ -55,7 +55,7 @@
           <w:sz w:val="26"/>
           <w:szCs w:val="26"/>
         </w:rPr>
-        <w:t>A Data Analytics Investigation Using the IBM HR Dataset</w:t>
+        <w:t>A Data Analytics Investigation Using the IBM HR Analytics Dataset</w:t>
       </w:r>
     </w:p>
     <w:p>
@@ -154,10 +154,8 @@
           <w:szCs w:val="24"/>
           <w:lang w:val="en-US"/>
         </w:rPr>
-        <w:t xml:space="preserve"> Sayyed Abed Ali</w:t>
-      </w:r>
-      <w:bookmarkStart w:id="0" w:name="_GoBack"/>
-      <w:bookmarkEnd w:id="0"/>
+        <w:t xml:space="preserve"> Sayyed Abed Ali </w:t>
+      </w:r>
     </w:p>
     <w:p>
       <w:pPr>
@@ -427,7 +425,7 @@
           <w:rFonts w:ascii="Calibri" w:hAnsi="Calibri" w:eastAsia="Calibri" w:cs="Calibri"/>
           <w:color w:val="1B2A3A"/>
         </w:rPr>
-        <w:t>Employee attrition — the rate at which employees leave an organisation — is one of the most controllable and costly problems a business faces. Replacing an employee typically costs a significant multiple of their annual salary once recruitment, onboarding, and lost productivity are accounted for. Despite this, many organisations respond to attrition reactively rather than using available data to anticipate and prevent it.</w:t>
+        <w:t>Employee attrition — the rate at which employees leave an organisation — is one of the most controllable and costly problems a business faces. Replacing an employee can be costly once recruitment, onboarding, and lost productivity are accounted for. Despite this, many organisations respond to attrition reactively rather than using available data to anticipate and prevent it.</w:t>
       </w:r>
     </w:p>
     <w:p>
@@ -514,7 +512,7 @@
           <w:bCs w:val="0"/>
           <w:color w:val="1B2A3A"/>
         </w:rPr>
-        <w:t>Can a simple, explainable statistical model confirm and rank these drivers?</w:t>
+        <w:t>Does a simple, explainable statistical model point to the same drivers?</w:t>
       </w:r>
     </w:p>
     <w:p>
@@ -563,7 +561,7 @@
           <w:rFonts w:ascii="Calibri" w:hAnsi="Calibri" w:eastAsia="Calibri" w:cs="Calibri"/>
           <w:color w:val="1B2A3A"/>
         </w:rPr>
-        <w:t>This analysis is descriptive and diagnostic (explaining what is happening and why), not purely predictive. Given a two-day project timeline, the scope was deliberately kept focused: one well-understood dataset, a small set of meaningful KPIs, and one explainable model — in line with the guidance that project quality is judged by clarity of business thinking, not technical complexity.</w:t>
+        <w:t>This analysis is descriptive and diagnostic (describing what is happening and which factors are associated with it), not purely predictive. The scope was deliberately kept focused: one well-understood dataset, a small set of meaningful KPIs, and one explainable model — in line with the guidance that project quality is judged by clarity of business thinking, not technical complexity.</w:t>
       </w:r>
     </w:p>
     <w:p>
@@ -635,7 +633,7 @@
           <w:rFonts w:ascii="Calibri" w:hAnsi="Calibri" w:eastAsia="Calibri" w:cs="Calibri"/>
           <w:color w:val="1B2A3A"/>
         </w:rPr>
-        <w:t>This is a fictional dataset created by IBM's own data science team specifically for analytics practice. It contains 1,470 employee records across 35 original attributes, including demographic details, compensation, job role, satisfaction scores, and tenure information.</w:t>
+        <w:t>This is a fictional dataset created by IBM data scientists, as stated on its Kaggle page; it does not contain real employee data. It contains 1,470 employee records across 35 original attributes, including demographic details, compensation, job role, satisfaction scores, and tenure information.</w:t>
       </w:r>
     </w:p>
     <w:p>
@@ -778,7 +776,7 @@
           <w:rFonts w:ascii="Calibri" w:hAnsi="Calibri" w:eastAsia="Calibri" w:cs="Calibri"/>
           <w:color w:val="1B2A3A"/>
         </w:rPr>
-        <w:t>Because this dataset is synthetically generated, it contains no real individuals and raises no personal privacy concerns. Its use here is for analytical practice and demonstration of methodology; the same approach could be applied to a real organisation's data under appropriate data governance.</w:t>
+        <w:t>Because this dataset is fictional, it contains no real individuals and raises no personal privacy concerns. Its use here is for analytical practice and demonstration of methodology; the same approach could be applied to a real organisation's data under appropriate data governance.</w:t>
       </w:r>
     </w:p>
     <w:p>
@@ -962,7 +960,7 @@
           <w:rFonts w:ascii="Calibri" w:hAnsi="Calibri" w:eastAsia="Calibri" w:cs="Calibri"/>
           <w:color w:val="1B2A3A"/>
         </w:rPr>
-        <w:t>The dataset was checked for missing values, duplicate rows, and invalid numeric ranges (e.g. negative income or age). None were found. This is expected given the dataset's curated, synthetic origin, and it allowed analytical effort to focus on deriving insight rather than repairing data.</w:t>
+        <w:t>The dataset was checked for missing values, duplicate rows, and invalid numeric ranges (e.g. negative income or age). None were found. This is expected given the dataset's curated, fictional origin, and it allowed analytical effort to focus on deriving insight rather than repairing data.</w:t>
       </w:r>
     </w:p>
     <w:p>
@@ -1267,7 +1265,7 @@
                 <w:sz w:val="22"/>
                 <w:szCs w:val="22"/>
               </w:rPr>
-              <w:t>KEY FINDING:  16.1% company-wide attrition (237 of 1,470 employees) sets the baseline against which every driver and segment below is compared.</w:t>
+              <w:t>KEY FINDING:  16.1% overall attrition (237 of 1,470 employees) sets the baseline against which every driver and segment below is compared.</w:t>
             </w:r>
           </w:p>
         </w:tc>
@@ -1368,7 +1366,7 @@
           <w:rFonts w:ascii="Calibri" w:hAnsi="Calibri" w:eastAsia="Calibri" w:cs="Calibri"/>
           <w:color w:val="1B2A3A"/>
         </w:rPr>
-        <w:t>Employees who work overtime leave at nearly three times the rate of those who don't — 30.5% compared to 10.4%. This is the single strongest individual driver found in the dataset.</w:t>
+        <w:t>Employees who work overtime leave at nearly three times the rate of those who don't — 30.5% compared to 10.4%. This is a large observed difference between the two groups. It is an association, and does not by itself show that overtime causes employees to leave.</w:t>
       </w:r>
     </w:p>
     <w:p>
@@ -1398,7 +1396,7 @@
           <w:rFonts w:ascii="Calibri" w:hAnsi="Calibri" w:eastAsia="Calibri" w:cs="Calibri"/>
           <w:color w:val="1B2A3A"/>
         </w:rPr>
-        <w:t>Employees in the lowest income quartile leave at 29.3%, compared to roughly 10–14% across the top three quartiles. This suggests relative underpayment — being paid noticeably less than peers — is a stronger signal than low pay in isolation.</w:t>
+        <w:t>Employees in the lowest income quartile leave at 29.3%, compared to roughly 10–14% across the top three quartiles. This shows that attrition is higher among the lowest-paid group in this dataset; because the analysis compares income quartiles only, it does not establish the reason.</w:t>
       </w:r>
     </w:p>
     <w:p>
@@ -1409,7 +1407,7 @@
       <w:r>
         <w:drawing>
           <wp:inline distT="0" distB="0" distL="0" distR="0">
-            <wp:extent cx="5905500" cy="2733675"/>
+            <wp:extent cx="5905500" cy="2713990"/>
             <wp:effectExtent l="0" t="0" r="0" b="0"/>
             <wp:docPr id="2" name="Picture 2"/>
             <wp:cNvGraphicFramePr>
@@ -1434,7 +1432,7 @@
                   <pic:spPr>
                     <a:xfrm>
                       <a:off x="0" y="0"/>
-                      <a:ext cx="5905500" cy="2733675"/>
+                      <a:ext cx="5905500" cy="2714166"/>
                     </a:xfrm>
                     <a:prstGeom prst="rect">
                       <a:avLst/>
@@ -1584,7 +1582,7 @@
           <w:rFonts w:ascii="Calibri" w:hAnsi="Calibri" w:eastAsia="Calibri" w:cs="Calibri"/>
           <w:color w:val="1B2A3A"/>
         </w:rPr>
-        <w:t>Attrition risk is heavily front-loaded: employees in their first year show a 34.9% attrition rate, falling steadily to 8.1% for employees with 10 or more years of tenure. This pattern reflects risk across the employee lifecycle rather than a change over calendar time, since the dataset is a single snapshot rather than multi-year tracking data.</w:t>
+        <w:t>Observed attrition is highest early in tenure: employees in their first year show a 34.9% attrition rate, falling steadily across the tenure groups (0–1, 2–3, 4–6, 7–9, and 10+ years) to 10.4% for employees with 10 or more years of tenure. This pattern reflects risk across the employee lifecycle rather than a change over calendar time, since the dataset is a single snapshot rather than multi-year tracking data.</w:t>
       </w:r>
     </w:p>
     <w:p>
@@ -1743,7 +1741,7 @@
                 <w:sz w:val="32"/>
                 <w:szCs w:val="32"/>
               </w:rPr>
-              <w:t>86 (5.8%)</w:t>
+              <w:t>86 (5.9%)</w:t>
             </w:r>
           </w:p>
         </w:tc>
@@ -1883,7 +1881,7 @@
           <w:rFonts w:ascii="Calibri" w:hAnsi="Calibri" w:eastAsia="Calibri" w:cs="Calibri"/>
           <w:color w:val="1B2A3A"/>
         </w:rPr>
-        <w:t>Of the 237 employees who left the company, 51 (21.5%) came from this single 86-person group — meaning just 5.8% of the workforce accounts for over a fifth of all attrition.</w:t>
+        <w:t>Of the 237 employees who left, 51 (21.5%) came from this single 86-person group — meaning just 5.9% of the workforce accounts for over a fifth of all attrition.</w:t>
       </w:r>
     </w:p>
     <w:tbl>
@@ -1949,7 +1947,7 @@
                 <w:sz w:val="22"/>
                 <w:szCs w:val="22"/>
               </w:rPr>
-              <w:t>KEY FINDING:  86 employees (5.8% of the workforce) account for 21.5% of all attrition — the single highest-leverage group for a targeted retention intervention.</w:t>
+              <w:t>KEY FINDING:  86 employees (5.9% of the workforce) account for 21.5% of all attrition — a priority group for a targeted retention intervention.</w:t>
             </w:r>
           </w:p>
         </w:tc>
@@ -2050,7 +2048,7 @@
           <w:rFonts w:ascii="Calibri" w:hAnsi="Calibri" w:eastAsia="Calibri" w:cs="Calibri"/>
           <w:color w:val="1B2A3A"/>
         </w:rPr>
-        <w:t>This finding reframes the retention problem from a broad, company-wide issue into a narrow, addressable one. Rather than a generic retention initiative, management can direct resources toward a specific, identifiable group with a very high concentration of risk — a far more efficient use of intervention budget and attention.</w:t>
+        <w:t>This finding reframes the retention problem from a broad, workforce-wide issue into a narrow, addressable one. Rather than a generic retention initiative, management can direct resources toward a specific, identifiable group with a very high concentration of risk — which could allow intervention effort to be more focused, although this project has not tested whether doing so would improve retention.</w:t>
       </w:r>
     </w:p>
     <w:p>
@@ -2512,7 +2510,7 @@
                 <w:sz w:val="22"/>
                 <w:szCs w:val="22"/>
               </w:rPr>
-              <w:t>KEY FINDING:  The model independently confirms the drivers found through direct analysis — Recall of 64.4% means nearly two-thirds of actual leavers would have been correctly flagged in advance.</w:t>
+              <w:t>KEY FINDING:  The model's results are consistent with the drivers found through direct analysis — a Recall of 64.4% means it identified nearly two-thirds of the actual leavers in the test set.</w:t>
             </w:r>
           </w:p>
         </w:tc>
@@ -2532,7 +2530,7 @@
           <w:rFonts w:ascii="Calibri" w:hAnsi="Calibri" w:eastAsia="Calibri" w:cs="Calibri"/>
           <w:color w:val="1B2A3A"/>
         </w:rPr>
-        <w:t>Recall is the most business-relevant metric here: of all employees who genuinely left, the model correctly flagged 64.4% of them in advance. Precision is lower (38.4%), meaning the model over-flags some employees who ultimately stayed — an acceptable trade-off for a retention-screening tool, where missing a true leaver is costlier than a false alarm.</w:t>
+        <w:t>Recall is the most business-relevant metric here: of the employees in the test set who genuinely left, the model correctly flagged 64.4% of them. Precision is lower (38.4%), meaning the model over-flags some employees who ultimately stayed — which may be an acceptable trade-off for a screening tool if missing a true leaver is considered costlier than a false alarm. Accuracy is less informative here: because only about 16% of employees left, a model that predicted "stays" for everyone would score 84.0% accuracy on this test set (368 employees, 59 of whom left), so the 77.7% accuracy should be read alongside recall and precision, and all four figures are indicative rather than precise.</w:t>
       </w:r>
     </w:p>
     <w:p>
@@ -2543,7 +2541,7 @@
       <w:r>
         <w:drawing>
           <wp:inline distT="0" distB="0" distL="0" distR="0">
-            <wp:extent cx="5905500" cy="2657475"/>
+            <wp:extent cx="5905500" cy="2432685"/>
             <wp:effectExtent l="0" t="0" r="0" b="0"/>
             <wp:docPr id="5" name="Picture 5"/>
             <wp:cNvGraphicFramePr>
@@ -2568,7 +2566,7 @@
                   <pic:spPr>
                     <a:xfrm>
                       <a:off x="0" y="0"/>
-                      <a:ext cx="5905500" cy="2657475"/>
+                      <a:ext cx="5905500" cy="2432977"/>
                     </a:xfrm>
                     <a:prstGeom prst="rect">
                       <a:avLst/>
@@ -2625,7 +2623,7 @@
           <w:rFonts w:ascii="Calibri" w:hAnsi="Calibri" w:eastAsia="Calibri" w:cs="Calibri"/>
           <w:color w:val="1B2A3A"/>
         </w:rPr>
-        <w:t>The model independently confirmed several drivers already found through exploratory analysis — overtime, frequent travel, and Sales roles all appear among the top risk-increasing factors. It also surfaced Laboratory Technician as a notable risk factor once other variables are controlled for, worth flagging for further HR investigation. Protective factors include long tenure with a current manager, higher satisfaction scores, and greater total working experience.</w:t>
+        <w:t>The model's results are consistent with several factors already seen in the exploratory analysis — overtime, frequent travel, and Sales roles all appear among the top risk-increasing factors. It also surfaced Laboratory Technician as a notable risk factor once other variables are controlled for, worth flagging for further HR investigation. JobLevel also appears among the risk-increasing coefficients, which differs from the direct comparison where Job Level 1 shows the highest attrition; because the model estimates each factor while holding the others constant, and JobLevel is closely related to income and experience, the two views should not be read as directly comparable. Protective factors include long tenure with a current manager, higher satisfaction scores, and greater total working experience.</w:t>
       </w:r>
     </w:p>
     <w:p>
@@ -2655,7 +2653,24 @@
           <w:rFonts w:ascii="Calibri" w:hAnsi="Calibri" w:eastAsia="Calibri" w:cs="Calibri"/>
           <w:color w:val="1B2A3A"/>
         </w:rPr>
-        <w:t>This model is used as a confirmation and ranking layer on top of the exploratory analysis, not as a replacement for it. Its purpose is to validate that the drivers identified through direct comparison remain significant when considered together, not to serve as a standalone forecasting tool for individual employees.</w:t>
+        <w:t xml:space="preserve">This model is used as a </w:t>
+      </w:r>
+      <w:r>
+        <w:rPr>
+          <w:rFonts w:hint="default" w:ascii="Calibri" w:hAnsi="Calibri" w:eastAsia="Calibri" w:cs="Calibri"/>
+          <w:color w:val="1B2A3A"/>
+          <w:lang w:val="en-US"/>
+        </w:rPr>
+        <w:tab/>
+      </w:r>
+      <w:bookmarkStart w:id="0" w:name="_GoBack"/>
+      <w:bookmarkEnd w:id="0"/>
+      <w:r>
+        <w:rPr>
+          <w:rFonts w:ascii="Calibri" w:hAnsi="Calibri" w:eastAsia="Calibri" w:cs="Calibri"/>
+          <w:color w:val="1B2A3A"/>
+        </w:rPr>
+        <w:t xml:space="preserve"> on top of the exploratory analysis, not as a replacement for it. Its purpose is to check whether the drivers identified through direct comparison still appear when the factors are considered together, not to serve as a standalone forecasting tool for individual employees. Its coefficients describe associations in this dataset and do not prove that any factor causes attrition.</w:t>
       </w:r>
     </w:p>
     <w:p>
@@ -2678,6 +2693,18 @@
     </w:p>
     <w:p>
       <w:pPr>
+        <w:spacing w:after="150"/>
+      </w:pPr>
+      <w:r>
+        <w:rPr>
+          <w:rFonts w:ascii="Calibri" w:hAnsi="Calibri" w:eastAsia="Calibri" w:cs="Calibri"/>
+          <w:color w:val="1B2A3A"/>
+        </w:rPr>
+        <w:t>These are proposed actions for further investigation and evaluation. None of them has been tested in this project.</w:t>
+      </w:r>
+    </w:p>
+    <w:p>
+      <w:pPr>
         <w:pStyle w:val="16"/>
         <w:numPr>
           <w:ilvl w:val="0"/>
@@ -2692,7 +2719,7 @@
           <w:bCs/>
           <w:color w:val="1B2A3A"/>
         </w:rPr>
-        <w:t>Monitor and cap overtime for new, entry-level employees — this group drives disproportionate attrition; a workload review here likely has the highest return on investment of any single intervention.</w:t>
+        <w:t>Review overtime workload for new, entry-level employees — this group accounts for a disproportionate share of observed attrition, so it is a sensible place to start (for example, by reviewing or, if appropriate, capping overtime).</w:t>
       </w:r>
     </w:p>
     <w:p>
@@ -2711,7 +2738,7 @@
           <w:bCs/>
           <w:color w:val="1B2A3A"/>
         </w:rPr>
-        <w:t>Audit the Sales Representative role — investigate whether workload, incentive structure, or role design is driving nearly 4 in 10 Sales Representatives to leave.</w:t>
+        <w:t>Review the Sales Representative role — observed attrition is highest in this role (39.8%); investigate whether workload, incentive structure, or role design play a part.</w:t>
       </w:r>
     </w:p>
     <w:p>
@@ -2730,7 +2757,7 @@
           <w:bCs/>
           <w:color w:val="1B2A3A"/>
         </w:rPr>
-        <w:t>Extend stock option eligibility earlier, especially to entry-level staff — the data shows a clear link between having any stock options and staying longer.</w:t>
+        <w:t>Review bottom-quartile pay bands — attrition is highest in the lowest income quartile in this dataset, so this group warrants a closer look.</w:t>
       </w:r>
     </w:p>
     <w:p>
@@ -2749,7 +2776,25 @@
           <w:bCs/>
           <w:color w:val="1B2A3A"/>
         </w:rPr>
-        <w:t>Review bottom-quartile pay bands — being underpaid relative to peers tracks more closely with attrition than low pay in isolation.</w:t>
+        <w:t>Consider a structured first-three-year check-in programme — observed attrition is highest early in tenure, so this is where an intervention could be piloted and its effect measured.</w:t>
+      </w:r>
+    </w:p>
+    <w:p>
+      <w:pPr>
+        <w:keepNext/>
+        <w:keepLines/>
+        <w:spacing w:before="550" w:after="160"/>
+      </w:pPr>
+      <w:r>
+        <w:rPr>
+          <w:rFonts w:ascii="Cambria" w:hAnsi="Cambria" w:eastAsia="Cambria" w:cs="Cambria"/>
+          <w:b/>
+          <w:bCs/>
+          <w:color w:val="065A82"/>
+          <w:sz w:val="34"/>
+          <w:szCs w:val="34"/>
+        </w:rPr>
+        <w:t>8. Limitations</w:t>
       </w:r>
     </w:p>
     <w:p>
@@ -2764,11 +2809,144 @@
       <w:r>
         <w:rPr>
           <w:rFonts w:ascii="Calibri" w:hAnsi="Calibri" w:eastAsia="Calibri" w:cs="Calibri"/>
-          <w:b/>
-          <w:bCs/>
-          <w:color w:val="1B2A3A"/>
-        </w:rPr>
-        <w:t>Formalise a first-3-year retention check-in programme — since risk is heavily front-loaded, early intervention has the greatest potential impact.</w:t>
+          <w:b w:val="0"/>
+          <w:bCs w:val="0"/>
+          <w:color w:val="1B2A3A"/>
+        </w:rPr>
+        <w:t>Correlation, not causation — findings show statistical association; no causal claim can be made without a controlled study.</w:t>
+      </w:r>
+    </w:p>
+    <w:p>
+      <w:pPr>
+        <w:pStyle w:val="16"/>
+        <w:numPr>
+          <w:ilvl w:val="0"/>
+          <w:numId w:val="1"/>
+        </w:numPr>
+        <w:spacing w:after="100"/>
+      </w:pPr>
+      <w:r>
+        <w:rPr>
+          <w:rFonts w:ascii="Calibri" w:hAnsi="Calibri" w:eastAsia="Calibri" w:cs="Calibri"/>
+          <w:b w:val="0"/>
+          <w:bCs w:val="0"/>
+          <w:color w:val="1B2A3A"/>
+        </w:rPr>
+        <w:t>Fictional dataset — results should not be generalised to a real organisation without validation on real HR data.</w:t>
+      </w:r>
+    </w:p>
+    <w:p>
+      <w:pPr>
+        <w:pStyle w:val="16"/>
+        <w:numPr>
+          <w:ilvl w:val="0"/>
+          <w:numId w:val="1"/>
+        </w:numPr>
+        <w:spacing w:after="100"/>
+      </w:pPr>
+      <w:r>
+        <w:rPr>
+          <w:rFonts w:ascii="Calibri" w:hAnsi="Calibri" w:eastAsia="Calibri" w:cs="Calibri"/>
+          <w:b w:val="0"/>
+          <w:bCs w:val="0"/>
+          <w:color w:val="1B2A3A"/>
+        </w:rPr>
+        <w:t>Static snapshot — the data has no timestamps beyond tenure fields, so trends over calendar time cannot be tracked.</w:t>
+      </w:r>
+    </w:p>
+    <w:p>
+      <w:pPr>
+        <w:pStyle w:val="16"/>
+        <w:numPr>
+          <w:ilvl w:val="0"/>
+          <w:numId w:val="1"/>
+        </w:numPr>
+        <w:spacing w:after="100"/>
+      </w:pPr>
+      <w:r>
+        <w:rPr>
+          <w:rFonts w:ascii="Calibri" w:hAnsi="Calibri" w:eastAsia="Calibri" w:cs="Calibri"/>
+          <w:b w:val="0"/>
+          <w:bCs w:val="0"/>
+          <w:color w:val="1B2A3A"/>
+        </w:rPr>
+        <w:t>Class imbalance — only ~16% of employees left, which naturally limits precision even with balancing applied.</w:t>
+      </w:r>
+    </w:p>
+    <w:p>
+      <w:pPr>
+        <w:pStyle w:val="16"/>
+        <w:numPr>
+          <w:ilvl w:val="0"/>
+          <w:numId w:val="1"/>
+        </w:numPr>
+        <w:spacing w:after="100"/>
+      </w:pPr>
+      <w:r>
+        <w:rPr>
+          <w:rFonts w:ascii="Calibri" w:hAnsi="Calibri" w:eastAsia="Calibri" w:cs="Calibri"/>
+          <w:b w:val="0"/>
+          <w:bCs w:val="0"/>
+          <w:color w:val="1B2A3A"/>
+        </w:rPr>
+        <w:t>Single model — Logistic Regression was chosen for explainability; a more complex ensemble model might predict marginally better but would be harder to interpret for business use.</w:t>
+      </w:r>
+    </w:p>
+    <w:p>
+      <w:pPr>
+        <w:pStyle w:val="16"/>
+        <w:numPr>
+          <w:ilvl w:val="0"/>
+          <w:numId w:val="1"/>
+        </w:numPr>
+        <w:spacing w:after="100"/>
+      </w:pPr>
+      <w:r>
+        <w:rPr>
+          <w:rFonts w:ascii="Calibri" w:hAnsi="Calibri" w:eastAsia="Calibri" w:cs="Calibri"/>
+          <w:b w:val="0"/>
+          <w:bCs w:val="0"/>
+          <w:color w:val="1B2A3A"/>
+        </w:rPr>
+        <w:t>Single train/test split — the model was evaluated on one 75/25 split (368 test employees, 59 of whom left) and cross-validation was not performed, so the reported metrics are indicative rather than precise.</w:t>
+      </w:r>
+    </w:p>
+    <w:p>
+      <w:pPr>
+        <w:pStyle w:val="16"/>
+        <w:numPr>
+          <w:ilvl w:val="0"/>
+          <w:numId w:val="1"/>
+        </w:numPr>
+        <w:spacing w:after="100"/>
+      </w:pPr>
+      <w:r>
+        <w:rPr>
+          <w:rFonts w:ascii="Calibri" w:hAnsi="Calibri" w:eastAsia="Calibri" w:cs="Calibri"/>
+          <w:b w:val="0"/>
+          <w:bCs w:val="0"/>
+          <w:color w:val="1B2A3A"/>
+        </w:rPr>
+        <w:t>Segment chosen after exploration — the high-risk segment combines factors identified during the exploratory analysis of this same dataset, so its attrition rate describes this dataset and may not hold in new data.</w:t>
+      </w:r>
+    </w:p>
+    <w:p>
+      <w:pPr>
+        <w:pStyle w:val="16"/>
+        <w:numPr>
+          <w:ilvl w:val="0"/>
+          <w:numId w:val="1"/>
+        </w:numPr>
+        <w:spacing w:after="100"/>
+      </w:pPr>
+      <w:r>
+        <w:rPr>
+          <w:rFonts w:ascii="Calibri" w:hAnsi="Calibri" w:eastAsia="Calibri" w:cs="Calibri"/>
+          <w:b w:val="0"/>
+          <w:bCs w:val="0"/>
+          <w:color w:val="1B2A3A"/>
+        </w:rPr>
+        <w:t>No demographic deep-dive — age and gender fields exist but were not the primary focus of this investigation; they may warrant separate, careful follow-up analysis.</w:t>
       </w:r>
     </w:p>
     <w:p>
@@ -2786,7 +2964,49 @@
           <w:sz w:val="34"/>
           <w:szCs w:val="34"/>
         </w:rPr>
-        <w:t>8. Limitations</w:t>
+        <w:t>9. Conclusion</w:t>
+      </w:r>
+    </w:p>
+    <w:p>
+      <w:pPr>
+        <w:spacing w:after="150"/>
+      </w:pPr>
+      <w:r>
+        <w:rPr>
+          <w:rFonts w:ascii="Calibri" w:hAnsi="Calibri" w:eastAsia="Calibri" w:cs="Calibri"/>
+          <w:color w:val="1B2A3A"/>
+        </w:rPr>
+        <w:t>This project set out to understand why employees leave and to translate that understanding into concrete action. The clearest finding is that attrition is not evenly spread across the workforce: a small, well-defined group — new, entry-level employees working overtime — has an observed attrition rate about 3.7 times the overall rate and accounts for more than a fifth of all departures. This gives management a specific, focused starting point rather than a vague workforce-wide concern.</w:t>
+      </w:r>
+    </w:p>
+    <w:p>
+      <w:pPr>
+        <w:spacing w:after="150"/>
+      </w:pPr>
+      <w:r>
+        <w:rPr>
+          <w:rFonts w:ascii="Calibri" w:hAnsi="Calibri" w:eastAsia="Calibri" w:cs="Calibri"/>
+          <w:color w:val="1B2A3A"/>
+        </w:rPr>
+        <w:t>Suggested next steps for an organisation acting on this analysis would include validating these patterns against real internal HR data, and running a small A/B test on one intervention (for example, an overtime cap for the identified high-risk segment) to measure its actual effect on retention before wider rollout.</w:t>
+      </w:r>
+    </w:p>
+    <w:p>
+      <w:pPr>
+        <w:keepNext/>
+        <w:keepLines/>
+        <w:spacing w:before="550" w:after="160"/>
+      </w:pPr>
+      <w:r>
+        <w:rPr>
+          <w:rFonts w:ascii="Cambria" w:hAnsi="Cambria" w:eastAsia="Cambria" w:cs="Cambria"/>
+          <w:b/>
+          <w:bCs/>
+          <w:color w:val="065A82"/>
+          <w:sz w:val="34"/>
+          <w:szCs w:val="34"/>
+        </w:rPr>
+        <w:t>10. References</w:t>
       </w:r>
     </w:p>
     <w:p>
@@ -2805,7 +3025,7 @@
           <w:bCs w:val="0"/>
           <w:color w:val="1B2A3A"/>
         </w:rPr>
-        <w:t>Correlation, not causation — findings show statistical association; no causal claim can be made without a controlled study.</w:t>
+        <w:t>Dataset: IBM HR Analytics Employee Attrition &amp; Performance, Kaggle (pavansubhasht).</w:t>
       </w:r>
     </w:p>
     <w:p>
@@ -2824,7 +3044,7 @@
           <w:bCs w:val="0"/>
           <w:color w:val="1B2A3A"/>
         </w:rPr>
-        <w:t>Fictional dataset — results should not be generalised to a real organisation without validation on real HR data.</w:t>
+        <w:t>scikit-learn documentation — https://scikit-learn.org/</w:t>
       </w:r>
     </w:p>
     <w:p>
@@ -2843,7 +3063,25 @@
           <w:bCs w:val="0"/>
           <w:color w:val="1B2A3A"/>
         </w:rPr>
-        <w:t>Static snapshot — the data has no timestamps beyond tenure fields, so trends over calendar time cannot be tracked.</w:t>
+        <w:t>Streamlit documentation — https://docs.streamlit.io/</w:t>
+      </w:r>
+    </w:p>
+    <w:p>
+      <w:pPr>
+        <w:keepNext/>
+        <w:keepLines/>
+        <w:spacing w:before="550" w:after="160"/>
+      </w:pPr>
+      <w:r>
+        <w:rPr>
+          <w:rFonts w:ascii="Cambria" w:hAnsi="Cambria" w:eastAsia="Cambria" w:cs="Cambria"/>
+          <w:b/>
+          <w:bCs/>
+          <w:color w:val="065A82"/>
+          <w:sz w:val="34"/>
+          <w:szCs w:val="34"/>
+        </w:rPr>
+        <w:t>Appendix A — Data Dictionary (Key Columns Used)</w:t>
       </w:r>
     </w:p>
     <w:p>
@@ -2862,7 +3100,7 @@
           <w:bCs w:val="0"/>
           <w:color w:val="1B2A3A"/>
         </w:rPr>
-        <w:t>Class imbalance — only ~16% of employees left, which naturally limits precision even with balancing applied.</w:t>
+        <w:t>Attrition / Left — whether the employee has left the company (target variable)</w:t>
       </w:r>
     </w:p>
     <w:p>
@@ -2881,7 +3119,7 @@
           <w:bCs w:val="0"/>
           <w:color w:val="1B2A3A"/>
         </w:rPr>
-        <w:t>Single model — Logistic Regression was chosen for explainability; a more complex ensemble model might predict marginally better but would be harder to interpret for business use.</w:t>
+        <w:t>OverTime — whether the employee works overtime (Yes/No)</w:t>
       </w:r>
     </w:p>
     <w:p>
@@ -2900,7 +3138,140 @@
           <w:bCs w:val="0"/>
           <w:color w:val="1B2A3A"/>
         </w:rPr>
-        <w:t>No demographic deep-dive — age and gender fields exist but were not the primary focus of this investigation; they may warrant separate, careful follow-up analysis.</w:t>
+        <w:t>MonthlyIncome — employee's monthly income</w:t>
+      </w:r>
+    </w:p>
+    <w:p>
+      <w:pPr>
+        <w:pStyle w:val="16"/>
+        <w:numPr>
+          <w:ilvl w:val="0"/>
+          <w:numId w:val="1"/>
+        </w:numPr>
+        <w:spacing w:after="100"/>
+      </w:pPr>
+      <w:r>
+        <w:rPr>
+          <w:rFonts w:ascii="Calibri" w:hAnsi="Calibri" w:eastAsia="Calibri" w:cs="Calibri"/>
+          <w:b w:val="0"/>
+          <w:bCs w:val="0"/>
+          <w:color w:val="1B2A3A"/>
+        </w:rPr>
+        <w:t>YearsAtCompany — tenure in years at the current company</w:t>
+      </w:r>
+    </w:p>
+    <w:p>
+      <w:pPr>
+        <w:pStyle w:val="16"/>
+        <w:numPr>
+          <w:ilvl w:val="0"/>
+          <w:numId w:val="1"/>
+        </w:numPr>
+        <w:spacing w:after="100"/>
+      </w:pPr>
+      <w:r>
+        <w:rPr>
+          <w:rFonts w:ascii="Calibri" w:hAnsi="Calibri" w:eastAsia="Calibri" w:cs="Calibri"/>
+          <w:b w:val="0"/>
+          <w:bCs w:val="0"/>
+          <w:color w:val="1B2A3A"/>
+        </w:rPr>
+        <w:t>JobLevel — job level on a 1–5 scale (this project treats level 1 as entry level)</w:t>
+      </w:r>
+    </w:p>
+    <w:p>
+      <w:pPr>
+        <w:pStyle w:val="16"/>
+        <w:numPr>
+          <w:ilvl w:val="0"/>
+          <w:numId w:val="1"/>
+        </w:numPr>
+        <w:spacing w:after="100"/>
+      </w:pPr>
+      <w:r>
+        <w:rPr>
+          <w:rFonts w:ascii="Calibri" w:hAnsi="Calibri" w:eastAsia="Calibri" w:cs="Calibri"/>
+          <w:b w:val="0"/>
+          <w:bCs w:val="0"/>
+          <w:color w:val="1B2A3A"/>
+        </w:rPr>
+        <w:t>JobRole — specific job title / function</w:t>
+      </w:r>
+    </w:p>
+    <w:p>
+      <w:pPr>
+        <w:pStyle w:val="16"/>
+        <w:numPr>
+          <w:ilvl w:val="0"/>
+          <w:numId w:val="1"/>
+        </w:numPr>
+        <w:spacing w:after="100"/>
+      </w:pPr>
+      <w:r>
+        <w:rPr>
+          <w:rFonts w:ascii="Calibri" w:hAnsi="Calibri" w:eastAsia="Calibri" w:cs="Calibri"/>
+          <w:b w:val="0"/>
+          <w:bCs w:val="0"/>
+          <w:color w:val="1B2A3A"/>
+        </w:rPr>
+        <w:t>BusinessTravel — frequency of work-related travel</w:t>
+      </w:r>
+    </w:p>
+    <w:p>
+      <w:pPr>
+        <w:pStyle w:val="16"/>
+        <w:numPr>
+          <w:ilvl w:val="0"/>
+          <w:numId w:val="1"/>
+        </w:numPr>
+        <w:spacing w:after="100"/>
+      </w:pPr>
+      <w:r>
+        <w:rPr>
+          <w:rFonts w:ascii="Calibri" w:hAnsi="Calibri" w:eastAsia="Calibri" w:cs="Calibri"/>
+          <w:b w:val="0"/>
+          <w:bCs w:val="0"/>
+          <w:color w:val="1B2A3A"/>
+        </w:rPr>
+        <w:t>StockOptionLevel — level of stock options granted, on a 0–3 scale</w:t>
+      </w:r>
+    </w:p>
+    <w:p>
+      <w:pPr>
+        <w:pStyle w:val="16"/>
+        <w:numPr>
+          <w:ilvl w:val="0"/>
+          <w:numId w:val="1"/>
+        </w:numPr>
+        <w:spacing w:after="100"/>
+      </w:pPr>
+      <w:r>
+        <w:rPr>
+          <w:rFonts w:ascii="Calibri" w:hAnsi="Calibri" w:eastAsia="Calibri" w:cs="Calibri"/>
+          <w:b w:val="0"/>
+          <w:bCs w:val="0"/>
+          <w:color w:val="1B2A3A"/>
+        </w:rPr>
+        <w:t>MaritalStatus — Single, Married, or Divorced</w:t>
+      </w:r>
+    </w:p>
+    <w:p>
+      <w:pPr>
+        <w:pStyle w:val="16"/>
+        <w:numPr>
+          <w:ilvl w:val="0"/>
+          <w:numId w:val="1"/>
+        </w:numPr>
+        <w:spacing w:after="100"/>
+      </w:pPr>
+      <w:r>
+        <w:rPr>
+          <w:rFonts w:ascii="Calibri" w:hAnsi="Calibri" w:eastAsia="Calibri" w:cs="Calibri"/>
+          <w:b w:val="0"/>
+          <w:bCs w:val="0"/>
+          <w:color w:val="1B2A3A"/>
+        </w:rPr>
+        <w:t>DistanceFromHome — distance from home to work (units not specified in the dataset)</w:t>
       </w:r>
     </w:p>
     <w:p>
@@ -2918,7 +3289,7 @@
           <w:sz w:val="34"/>
           <w:szCs w:val="34"/>
         </w:rPr>
-        <w:t>9. Conclusion</w:t>
+        <w:t>Appendix B — Dashboard Screenshots</w:t>
       </w:r>
     </w:p>
     <w:p>
@@ -2930,332 +3301,7 @@
           <w:rFonts w:ascii="Calibri" w:hAnsi="Calibri" w:eastAsia="Calibri" w:cs="Calibri"/>
           <w:color w:val="1B2A3A"/>
         </w:rPr>
-        <w:t>This project set out to understand why employees leave and to translate that understanding into concrete action. The clearest finding is that attrition is not evenly spread across the workforce: a small, well-defined group — new, entry-level employees working overtime — carries nearly four times the average attrition risk and accounts for more than a fifth of all departures. This gives management a specific, high-leverage starting point rather than a vague company-wide concern.</w:t>
-      </w:r>
-    </w:p>
-    <w:p>
-      <w:pPr>
-        <w:spacing w:after="150"/>
-      </w:pPr>
-      <w:r>
-        <w:rPr>
-          <w:rFonts w:ascii="Calibri" w:hAnsi="Calibri" w:eastAsia="Calibri" w:cs="Calibri"/>
-          <w:color w:val="1B2A3A"/>
-        </w:rPr>
-        <w:t>Suggested next steps for an organisation acting on this analysis would include validating these patterns against real internal HR data, and running a small A/B test on one intervention (for example, an overtime cap for the identified high-risk segment) to measure its actual effect on retention before wider rollout.</w:t>
-      </w:r>
-    </w:p>
-    <w:p>
-      <w:pPr>
-        <w:keepNext/>
-        <w:keepLines/>
-        <w:spacing w:before="550" w:after="160"/>
-      </w:pPr>
-      <w:r>
-        <w:rPr>
-          <w:rFonts w:ascii="Cambria" w:hAnsi="Cambria" w:eastAsia="Cambria" w:cs="Cambria"/>
-          <w:b/>
-          <w:bCs/>
-          <w:color w:val="065A82"/>
-          <w:sz w:val="34"/>
-          <w:szCs w:val="34"/>
-        </w:rPr>
-        <w:t>10. References</w:t>
-      </w:r>
-    </w:p>
-    <w:p>
-      <w:pPr>
-        <w:pStyle w:val="16"/>
-        <w:numPr>
-          <w:ilvl w:val="0"/>
-          <w:numId w:val="1"/>
-        </w:numPr>
-        <w:spacing w:after="100"/>
-      </w:pPr>
-      <w:r>
-        <w:rPr>
-          <w:rFonts w:ascii="Calibri" w:hAnsi="Calibri" w:eastAsia="Calibri" w:cs="Calibri"/>
-          <w:b w:val="0"/>
-          <w:bCs w:val="0"/>
-          <w:color w:val="1B2A3A"/>
-        </w:rPr>
-        <w:t>Dataset: IBM HR Analytics Employee Attrition &amp; Performance, Kaggle (pavansubhasht).</w:t>
-      </w:r>
-    </w:p>
-    <w:p>
-      <w:pPr>
-        <w:pStyle w:val="16"/>
-        <w:numPr>
-          <w:ilvl w:val="0"/>
-          <w:numId w:val="1"/>
-        </w:numPr>
-        <w:spacing w:after="100"/>
-      </w:pPr>
-      <w:r>
-        <w:rPr>
-          <w:rFonts w:ascii="Calibri" w:hAnsi="Calibri" w:eastAsia="Calibri" w:cs="Calibri"/>
-          <w:b w:val="0"/>
-          <w:bCs w:val="0"/>
-          <w:color w:val="1B2A3A"/>
-        </w:rPr>
-        <w:t>scikit-learn documentation — https://scikit-learn.org/</w:t>
-      </w:r>
-    </w:p>
-    <w:p>
-      <w:pPr>
-        <w:pStyle w:val="16"/>
-        <w:numPr>
-          <w:ilvl w:val="0"/>
-          <w:numId w:val="1"/>
-        </w:numPr>
-        <w:spacing w:after="100"/>
-      </w:pPr>
-      <w:r>
-        <w:rPr>
-          <w:rFonts w:ascii="Calibri" w:hAnsi="Calibri" w:eastAsia="Calibri" w:cs="Calibri"/>
-          <w:b w:val="0"/>
-          <w:bCs w:val="0"/>
-          <w:color w:val="1B2A3A"/>
-        </w:rPr>
-        <w:t>Streamlit documentation — https://docs.streamlit.io/</w:t>
-      </w:r>
-    </w:p>
-    <w:p>
-      <w:pPr>
-        <w:keepNext/>
-        <w:keepLines/>
-        <w:spacing w:before="550" w:after="160"/>
-      </w:pPr>
-      <w:r>
-        <w:rPr>
-          <w:rFonts w:ascii="Cambria" w:hAnsi="Cambria" w:eastAsia="Cambria" w:cs="Cambria"/>
-          <w:b/>
-          <w:bCs/>
-          <w:color w:val="065A82"/>
-          <w:sz w:val="34"/>
-          <w:szCs w:val="34"/>
-        </w:rPr>
-        <w:t>Appendix A — Data Dictionary (Key Columns Used)</w:t>
-      </w:r>
-    </w:p>
-    <w:p>
-      <w:pPr>
-        <w:pStyle w:val="16"/>
-        <w:numPr>
-          <w:ilvl w:val="0"/>
-          <w:numId w:val="1"/>
-        </w:numPr>
-        <w:spacing w:after="100"/>
-      </w:pPr>
-      <w:r>
-        <w:rPr>
-          <w:rFonts w:ascii="Calibri" w:hAnsi="Calibri" w:eastAsia="Calibri" w:cs="Calibri"/>
-          <w:b w:val="0"/>
-          <w:bCs w:val="0"/>
-          <w:color w:val="1B2A3A"/>
-        </w:rPr>
-        <w:t>Attrition / Left — whether the employee has left the company (target variable)</w:t>
-      </w:r>
-    </w:p>
-    <w:p>
-      <w:pPr>
-        <w:pStyle w:val="16"/>
-        <w:numPr>
-          <w:ilvl w:val="0"/>
-          <w:numId w:val="1"/>
-        </w:numPr>
-        <w:spacing w:after="100"/>
-      </w:pPr>
-      <w:r>
-        <w:rPr>
-          <w:rFonts w:ascii="Calibri" w:hAnsi="Calibri" w:eastAsia="Calibri" w:cs="Calibri"/>
-          <w:b w:val="0"/>
-          <w:bCs w:val="0"/>
-          <w:color w:val="1B2A3A"/>
-        </w:rPr>
-        <w:t>OverTime — whether the employee regularly works overtime (Yes/No)</w:t>
-      </w:r>
-    </w:p>
-    <w:p>
-      <w:pPr>
-        <w:pStyle w:val="16"/>
-        <w:numPr>
-          <w:ilvl w:val="0"/>
-          <w:numId w:val="1"/>
-        </w:numPr>
-        <w:spacing w:after="100"/>
-      </w:pPr>
-      <w:r>
-        <w:rPr>
-          <w:rFonts w:ascii="Calibri" w:hAnsi="Calibri" w:eastAsia="Calibri" w:cs="Calibri"/>
-          <w:b w:val="0"/>
-          <w:bCs w:val="0"/>
-          <w:color w:val="1B2A3A"/>
-        </w:rPr>
-        <w:t>MonthlyIncome — employee's monthly salary</w:t>
-      </w:r>
-    </w:p>
-    <w:p>
-      <w:pPr>
-        <w:pStyle w:val="16"/>
-        <w:numPr>
-          <w:ilvl w:val="0"/>
-          <w:numId w:val="1"/>
-        </w:numPr>
-        <w:spacing w:after="100"/>
-      </w:pPr>
-      <w:r>
-        <w:rPr>
-          <w:rFonts w:ascii="Calibri" w:hAnsi="Calibri" w:eastAsia="Calibri" w:cs="Calibri"/>
-          <w:b w:val="0"/>
-          <w:bCs w:val="0"/>
-          <w:color w:val="1B2A3A"/>
-        </w:rPr>
-        <w:t>YearsAtCompany — tenure in years at the current company</w:t>
-      </w:r>
-    </w:p>
-    <w:p>
-      <w:pPr>
-        <w:pStyle w:val="16"/>
-        <w:numPr>
-          <w:ilvl w:val="0"/>
-          <w:numId w:val="1"/>
-        </w:numPr>
-        <w:spacing w:after="100"/>
-      </w:pPr>
-      <w:r>
-        <w:rPr>
-          <w:rFonts w:ascii="Calibri" w:hAnsi="Calibri" w:eastAsia="Calibri" w:cs="Calibri"/>
-          <w:b w:val="0"/>
-          <w:bCs w:val="0"/>
-          <w:color w:val="1B2A3A"/>
-        </w:rPr>
-        <w:t>JobLevel — seniority level, 1 (entry) to 5 (executive)</w:t>
-      </w:r>
-    </w:p>
-    <w:p>
-      <w:pPr>
-        <w:pStyle w:val="16"/>
-        <w:numPr>
-          <w:ilvl w:val="0"/>
-          <w:numId w:val="1"/>
-        </w:numPr>
-        <w:spacing w:after="100"/>
-      </w:pPr>
-      <w:r>
-        <w:rPr>
-          <w:rFonts w:ascii="Calibri" w:hAnsi="Calibri" w:eastAsia="Calibri" w:cs="Calibri"/>
-          <w:b w:val="0"/>
-          <w:bCs w:val="0"/>
-          <w:color w:val="1B2A3A"/>
-        </w:rPr>
-        <w:t>JobRole — specific job title / function</w:t>
-      </w:r>
-    </w:p>
-    <w:p>
-      <w:pPr>
-        <w:pStyle w:val="16"/>
-        <w:numPr>
-          <w:ilvl w:val="0"/>
-          <w:numId w:val="1"/>
-        </w:numPr>
-        <w:spacing w:after="100"/>
-      </w:pPr>
-      <w:r>
-        <w:rPr>
-          <w:rFonts w:ascii="Calibri" w:hAnsi="Calibri" w:eastAsia="Calibri" w:cs="Calibri"/>
-          <w:b w:val="0"/>
-          <w:bCs w:val="0"/>
-          <w:color w:val="1B2A3A"/>
-        </w:rPr>
-        <w:t>BusinessTravel — frequency of work-related travel</w:t>
-      </w:r>
-    </w:p>
-    <w:p>
-      <w:pPr>
-        <w:pStyle w:val="16"/>
-        <w:numPr>
-          <w:ilvl w:val="0"/>
-          <w:numId w:val="1"/>
-        </w:numPr>
-        <w:spacing w:after="100"/>
-      </w:pPr>
-      <w:r>
-        <w:rPr>
-          <w:rFonts w:ascii="Calibri" w:hAnsi="Calibri" w:eastAsia="Calibri" w:cs="Calibri"/>
-          <w:b w:val="0"/>
-          <w:bCs w:val="0"/>
-          <w:color w:val="1B2A3A"/>
-        </w:rPr>
-        <w:t>StockOptionLevel — level of stock options granted, 0 (none) to 3 (highest)</w:t>
-      </w:r>
-    </w:p>
-    <w:p>
-      <w:pPr>
-        <w:pStyle w:val="16"/>
-        <w:numPr>
-          <w:ilvl w:val="0"/>
-          <w:numId w:val="1"/>
-        </w:numPr>
-        <w:spacing w:after="100"/>
-      </w:pPr>
-      <w:r>
-        <w:rPr>
-          <w:rFonts w:ascii="Calibri" w:hAnsi="Calibri" w:eastAsia="Calibri" w:cs="Calibri"/>
-          <w:b w:val="0"/>
-          <w:bCs w:val="0"/>
-          <w:color w:val="1B2A3A"/>
-        </w:rPr>
-        <w:t>MaritalStatus — Single, Married, or Divorced</w:t>
-      </w:r>
-    </w:p>
-    <w:p>
-      <w:pPr>
-        <w:pStyle w:val="16"/>
-        <w:numPr>
-          <w:ilvl w:val="0"/>
-          <w:numId w:val="1"/>
-        </w:numPr>
-        <w:spacing w:after="100"/>
-      </w:pPr>
-      <w:r>
-        <w:rPr>
-          <w:rFonts w:ascii="Calibri" w:hAnsi="Calibri" w:eastAsia="Calibri" w:cs="Calibri"/>
-          <w:b w:val="0"/>
-          <w:bCs w:val="0"/>
-          <w:color w:val="1B2A3A"/>
-        </w:rPr>
-        <w:t>DistanceFromHome — commute distance in miles</w:t>
-      </w:r>
-    </w:p>
-    <w:p>
-      <w:pPr>
-        <w:keepNext/>
-        <w:keepLines/>
-        <w:spacing w:before="550" w:after="160"/>
-      </w:pPr>
-      <w:r>
-        <w:rPr>
-          <w:rFonts w:ascii="Cambria" w:hAnsi="Cambria" w:eastAsia="Cambria" w:cs="Cambria"/>
-          <w:b/>
-          <w:bCs/>
-          <w:color w:val="065A82"/>
-          <w:sz w:val="34"/>
-          <w:szCs w:val="34"/>
-        </w:rPr>
-        <w:t>Appendix B — Dashboard Screenshots</w:t>
-      </w:r>
-    </w:p>
-    <w:p>
-      <w:pPr>
-        <w:spacing w:after="150"/>
-      </w:pPr>
-      <w:r>
-        <w:rPr>
-          <w:rFonts w:ascii="Calibri" w:hAnsi="Calibri" w:eastAsia="Calibri" w:cs="Calibri"/>
-          <w:color w:val="1B2A3A"/>
-        </w:rPr>
-        <w:t>The screenshots below are preview captures from the live, interactive Streamlit dashboard (attrition_dashboard.py). Each tab's content is taller than a single screen, so two sequential screenshots — top and continued — are shown per tab to capture the complete tab without cropping mid-chart. These are not a single combined screenshot.</w:t>
+        <w:t>The screenshots below are captures from the interactive Streamlit dashboard (ZohraSayyed_EmployeeAttritionRetentionIntelligence.py), taken from the final version of the code. Where a tab is taller than one screen, two sequential screenshots — top and continued — are shown; they are not a single combined screenshot. The B.4 Part 2 capture is trimmed at the top to remove a partly cut-off heading.</w:t>
       </w:r>
     </w:p>
     <w:p>
@@ -3347,7 +3393,7 @@
       <w:r>
         <w:drawing>
           <wp:inline distT="0" distB="0" distL="0" distR="0">
-            <wp:extent cx="5905500" cy="2724150"/>
+            <wp:extent cx="5334000" cy="2741295"/>
             <wp:effectExtent l="0" t="0" r="0" b="0"/>
             <wp:docPr id="7" name="Picture 7"/>
             <wp:cNvGraphicFramePr>
@@ -3372,7 +3418,7 @@
                   <pic:spPr>
                     <a:xfrm>
                       <a:off x="0" y="0"/>
-                      <a:ext cx="5905500" cy="2724150"/>
+                      <a:ext cx="5334000" cy="2741570"/>
                     </a:xfrm>
                     <a:prstGeom prst="rect">
                       <a:avLst/>
@@ -3428,7 +3474,7 @@
       <w:r>
         <w:drawing>
           <wp:inline distT="0" distB="0" distL="0" distR="0">
-            <wp:extent cx="5905500" cy="2733675"/>
+            <wp:extent cx="5905500" cy="2713990"/>
             <wp:effectExtent l="0" t="0" r="0" b="0"/>
             <wp:docPr id="8" name="Picture 8"/>
             <wp:cNvGraphicFramePr>
@@ -3453,7 +3499,7 @@
                   <pic:spPr>
                     <a:xfrm>
                       <a:off x="0" y="0"/>
-                      <a:ext cx="5905500" cy="2733675"/>
+                      <a:ext cx="5905500" cy="2714166"/>
                     </a:xfrm>
                     <a:prstGeom prst="rect">
                       <a:avLst/>
@@ -3716,7 +3762,70 @@
       <w:r>
         <w:drawing>
           <wp:inline distT="0" distB="0" distL="0" distR="0">
-            <wp:extent cx="5905500" cy="2524125"/>
+            <wp:extent cx="5905500" cy="2656205"/>
+            <wp:effectExtent l="0" t="0" r="0" b="0"/>
+            <wp:docPr id="901" name="Picture 901"/>
+            <wp:cNvGraphicFramePr>
+              <a:graphicFrameLocks xmlns:a="http://schemas.openxmlformats.org/drawingml/2006/main" noChangeAspect="1"/>
+            </wp:cNvGraphicFramePr>
+            <a:graphic xmlns:a="http://schemas.openxmlformats.org/drawingml/2006/main">
+              <a:graphicData uri="http://schemas.openxmlformats.org/drawingml/2006/picture">
+                <pic:pic xmlns:pic="http://schemas.openxmlformats.org/drawingml/2006/picture">
+                  <pic:nvPicPr>
+                    <pic:cNvPr id="901" name="Picture 901"/>
+                    <pic:cNvPicPr>
+                      <a:picLocks noChangeAspect="1" noChangeArrowheads="1"/>
+                    </pic:cNvPicPr>
+                  </pic:nvPicPr>
+                  <pic:blipFill>
+                    <a:blip r:embed="rId15"/>
+                    <a:srcRect/>
+                    <a:stretch>
+                      <a:fillRect/>
+                    </a:stretch>
+                  </pic:blipFill>
+                  <pic:spPr>
+                    <a:xfrm>
+                      <a:off x="0" y="0"/>
+                      <a:ext cx="5905500" cy="2656577"/>
+                    </a:xfrm>
+                    <a:prstGeom prst="rect">
+                      <a:avLst/>
+                    </a:prstGeom>
+                  </pic:spPr>
+                </pic:pic>
+              </a:graphicData>
+            </a:graphic>
+          </wp:inline>
+        </w:drawing>
+      </w:r>
+    </w:p>
+    <w:p>
+      <w:pPr>
+        <w:spacing w:after="200"/>
+        <w:jc w:val="center"/>
+      </w:pPr>
+      <w:r>
+        <w:rPr>
+          <w:rFonts w:ascii="Calibri" w:hAnsi="Calibri" w:eastAsia="Calibri" w:cs="Calibri"/>
+          <w:i/>
+          <w:iCs/>
+          <w:color w:val="5C6B7A"/>
+          <w:sz w:val="20"/>
+          <w:szCs w:val="20"/>
+        </w:rPr>
+        <w:t>Part 1 of 2 — Model &amp; Recommendations (top)</w:t>
+      </w:r>
+    </w:p>
+    <w:p>
+      <w:pPr>
+        <w:spacing w:before="100" w:after="90"/>
+        <w:jc w:val="center"/>
+      </w:pPr>
+      <w:r>
+        <w:drawing>
+          <wp:inline distT="0" distB="0" distL="0" distR="0">
+            <wp:extent cx="5905500" cy="2432685"/>
             <wp:effectExtent l="0" t="0" r="0" b="0"/>
             <wp:docPr id="12" name="Picture 12"/>
             <wp:cNvGraphicFramePr>
@@ -3732,69 +3841,6 @@
                     </pic:cNvPicPr>
                   </pic:nvPicPr>
                   <pic:blipFill>
-                    <a:blip r:embed="rId15"/>
-                    <a:srcRect/>
-                    <a:stretch>
-                      <a:fillRect/>
-                    </a:stretch>
-                  </pic:blipFill>
-                  <pic:spPr>
-                    <a:xfrm>
-                      <a:off x="0" y="0"/>
-                      <a:ext cx="5905500" cy="2524125"/>
-                    </a:xfrm>
-                    <a:prstGeom prst="rect">
-                      <a:avLst/>
-                    </a:prstGeom>
-                  </pic:spPr>
-                </pic:pic>
-              </a:graphicData>
-            </a:graphic>
-          </wp:inline>
-        </w:drawing>
-      </w:r>
-    </w:p>
-    <w:p>
-      <w:pPr>
-        <w:spacing w:after="200"/>
-        <w:jc w:val="center"/>
-      </w:pPr>
-      <w:r>
-        <w:rPr>
-          <w:rFonts w:ascii="Calibri" w:hAnsi="Calibri" w:eastAsia="Calibri" w:cs="Calibri"/>
-          <w:i/>
-          <w:iCs/>
-          <w:color w:val="5C6B7A"/>
-          <w:sz w:val="20"/>
-          <w:szCs w:val="20"/>
-        </w:rPr>
-        <w:t>Part 1 of 2 — Model &amp; Recommendations (top)</w:t>
-      </w:r>
-    </w:p>
-    <w:p>
-      <w:pPr>
-        <w:spacing w:before="100" w:after="90"/>
-        <w:jc w:val="center"/>
-      </w:pPr>
-      <w:r>
-        <w:drawing>
-          <wp:inline distT="0" distB="0" distL="0" distR="0">
-            <wp:extent cx="5905500" cy="2657475"/>
-            <wp:effectExtent l="0" t="0" r="0" b="0"/>
-            <wp:docPr id="13" name="Picture 13"/>
-            <wp:cNvGraphicFramePr>
-              <a:graphicFrameLocks xmlns:a="http://schemas.openxmlformats.org/drawingml/2006/main" noChangeAspect="1"/>
-            </wp:cNvGraphicFramePr>
-            <a:graphic xmlns:a="http://schemas.openxmlformats.org/drawingml/2006/main">
-              <a:graphicData uri="http://schemas.openxmlformats.org/drawingml/2006/picture">
-                <pic:pic xmlns:pic="http://schemas.openxmlformats.org/drawingml/2006/picture">
-                  <pic:nvPicPr>
-                    <pic:cNvPr id="13" name="Picture 13"/>
-                    <pic:cNvPicPr>
-                      <a:picLocks noChangeAspect="1" noChangeArrowheads="1"/>
-                    </pic:cNvPicPr>
-                  </pic:nvPicPr>
-                  <pic:blipFill>
                     <a:blip r:embed="rId12"/>
                     <a:srcRect/>
                     <a:stretch>
@@ -3804,7 +3850,7 @@
                   <pic:spPr>
                     <a:xfrm>
                       <a:off x="0" y="0"/>
-                      <a:ext cx="5905500" cy="2657475"/>
+                      <a:ext cx="5905500" cy="2432977"/>
                     </a:xfrm>
                     <a:prstGeom prst="rect">
                       <a:avLst/>
@@ -4072,7 +4118,7 @@
     <w:lsdException w:unhideWhenUsed="0" w:uiPriority="0" w:semiHidden="0" w:name="toc 8"/>
     <w:lsdException w:unhideWhenUsed="0" w:uiPriority="0" w:semiHidden="0" w:name="toc 9"/>
     <w:lsdException w:unhideWhenUsed="0" w:uiPriority="0" w:semiHidden="0" w:name="Normal Indent"/>
-    <w:lsdException w:uiPriority="99" w:name="footnote text"/>
+    <w:lsdException w:qFormat="1" w:uiPriority="99" w:name="footnote text"/>
     <w:lsdException w:unhideWhenUsed="0" w:uiPriority="0" w:semiHidden="0" w:name="annotation text"/>
     <w:lsdException w:unhideWhenUsed="0" w:uiPriority="0" w:semiHidden="0" w:name="header"/>
     <w:lsdException w:unhideWhenUsed="0" w:uiPriority="0" w:semiHidden="0" w:name="footer"/>
@@ -4085,8 +4131,8 @@
     <w:lsdException w:unhideWhenUsed="0" w:uiPriority="0" w:semiHidden="0" w:name="annotation reference"/>
     <w:lsdException w:unhideWhenUsed="0" w:uiPriority="0" w:semiHidden="0" w:name="line number"/>
     <w:lsdException w:unhideWhenUsed="0" w:uiPriority="0" w:semiHidden="0" w:name="page number"/>
-    <w:lsdException w:uiPriority="99" w:name="endnote reference"/>
-    <w:lsdException w:uiPriority="99" w:name="endnote text"/>
+    <w:lsdException w:qFormat="1" w:uiPriority="99" w:name="endnote reference"/>
+    <w:lsdException w:qFormat="1" w:uiPriority="99" w:name="endnote text"/>
     <w:lsdException w:unhideWhenUsed="0" w:uiPriority="0" w:semiHidden="0" w:name="table of authorities"/>
     <w:lsdException w:unhideWhenUsed="0" w:uiPriority="0" w:semiHidden="0" w:name="macro"/>
     <w:lsdException w:unhideWhenUsed="0" w:uiPriority="0" w:semiHidden="0" w:name="toa heading"/>
@@ -4128,7 +4174,7 @@
     <w:lsdException w:unhideWhenUsed="0" w:uiPriority="0" w:semiHidden="0" w:name="Body Text Indent 2"/>
     <w:lsdException w:unhideWhenUsed="0" w:uiPriority="0" w:semiHidden="0" w:name="Body Text Indent 3"/>
     <w:lsdException w:unhideWhenUsed="0" w:uiPriority="0" w:semiHidden="0" w:name="Block Text"/>
-    <w:lsdException w:uiPriority="99" w:semiHidden="0" w:name="Hyperlink"/>
+    <w:lsdException w:qFormat="1" w:uiPriority="99" w:semiHidden="0" w:name="Hyperlink"/>
     <w:lsdException w:unhideWhenUsed="0" w:uiPriority="0" w:semiHidden="0" w:name="FollowedHyperlink"/>
     <w:lsdException w:qFormat="1" w:unhideWhenUsed="0" w:uiPriority="0" w:semiHidden="0" w:name="Strong"/>
     <w:lsdException w:qFormat="1" w:unhideWhenUsed="0" w:uiPriority="0" w:semiHidden="0" w:name="Emphasis"/>
@@ -4298,6 +4344,7 @@
     <w:qFormat/>
     <w:uiPriority w:val="0"/>
     <w:rPr>
+      <w:rFonts w:asciiTheme="minorHAnsi" w:hAnsiTheme="minorHAnsi" w:eastAsiaTheme="minorEastAsia" w:cstheme="minorBidi"/>
       <w:sz w:val="21"/>
       <w:szCs w:val="22"/>
     </w:rPr>
@@ -4308,6 +4355,7 @@
     <w:qFormat/>
     <w:uiPriority w:val="0"/>
     <w:rPr>
+      <w:rFonts w:asciiTheme="minorHAnsi" w:hAnsiTheme="minorHAnsi" w:eastAsiaTheme="minorEastAsia" w:cstheme="minorBidi"/>
       <w:color w:val="2E74B5"/>
       <w:sz w:val="32"/>
       <w:szCs w:val="32"/>
@@ -4319,6 +4367,7 @@
     <w:qFormat/>
     <w:uiPriority w:val="0"/>
     <w:rPr>
+      <w:rFonts w:asciiTheme="minorHAnsi" w:hAnsiTheme="minorHAnsi" w:eastAsiaTheme="minorEastAsia" w:cstheme="minorBidi"/>
       <w:color w:val="2E74B5"/>
       <w:sz w:val="26"/>
       <w:szCs w:val="26"/>
@@ -4330,6 +4379,7 @@
     <w:qFormat/>
     <w:uiPriority w:val="0"/>
     <w:rPr>
+      <w:rFonts w:asciiTheme="minorHAnsi" w:hAnsiTheme="minorHAnsi" w:eastAsiaTheme="minorEastAsia" w:cstheme="minorBidi"/>
       <w:color w:val="1F4D78"/>
       <w:sz w:val="24"/>
       <w:szCs w:val="24"/>
@@ -4341,6 +4391,7 @@
     <w:qFormat/>
     <w:uiPriority w:val="0"/>
     <w:rPr>
+      <w:rFonts w:asciiTheme="minorHAnsi" w:hAnsiTheme="minorHAnsi" w:eastAsiaTheme="minorEastAsia" w:cstheme="minorBidi"/>
       <w:i/>
       <w:iCs/>
       <w:color w:val="2E74B5"/>
@@ -4354,6 +4405,7 @@
     <w:qFormat/>
     <w:uiPriority w:val="0"/>
     <w:rPr>
+      <w:rFonts w:asciiTheme="minorHAnsi" w:hAnsiTheme="minorHAnsi" w:eastAsiaTheme="minorEastAsia" w:cstheme="minorBidi"/>
       <w:color w:val="2E74B5"/>
       <w:sz w:val="21"/>
       <w:szCs w:val="22"/>
@@ -4365,6 +4417,7 @@
     <w:qFormat/>
     <w:uiPriority w:val="0"/>
     <w:rPr>
+      <w:rFonts w:asciiTheme="minorHAnsi" w:hAnsiTheme="minorHAnsi" w:eastAsiaTheme="minorEastAsia" w:cstheme="minorBidi"/>
       <w:color w:val="1F4D78"/>
       <w:sz w:val="21"/>
       <w:szCs w:val="22"/>
@@ -4394,6 +4447,7 @@
     <w:name w:val="endnote reference"/>
     <w:semiHidden/>
     <w:unhideWhenUsed/>
+    <w:qFormat/>
     <w:uiPriority w:val="99"/>
     <w:rPr>
       <w:vertAlign w:val="superscript"/>
@@ -4404,11 +4458,13 @@
     <w:link w:val="18"/>
     <w:semiHidden/>
     <w:unhideWhenUsed/>
+    <w:qFormat/>
     <w:uiPriority w:val="99"/>
     <w:pPr>
       <w:spacing w:after="0" w:line="240" w:lineRule="auto"/>
     </w:pPr>
     <w:rPr>
+      <w:rFonts w:asciiTheme="minorHAnsi" w:hAnsiTheme="minorHAnsi" w:eastAsiaTheme="minorEastAsia" w:cstheme="minorBidi"/>
       <w:sz w:val="20"/>
       <w:szCs w:val="20"/>
     </w:rPr>
@@ -4428,11 +4484,13 @@
     <w:link w:val="17"/>
     <w:semiHidden/>
     <w:unhideWhenUsed/>
+    <w:qFormat/>
     <w:uiPriority w:val="99"/>
     <w:pPr>
       <w:spacing w:after="0" w:line="240" w:lineRule="auto"/>
     </w:pPr>
     <w:rPr>
+      <w:rFonts w:asciiTheme="minorHAnsi" w:hAnsiTheme="minorHAnsi" w:eastAsiaTheme="minorEastAsia" w:cstheme="minorBidi"/>
       <w:sz w:val="20"/>
       <w:szCs w:val="20"/>
     </w:rPr>
@@ -4440,6 +4498,7 @@
   <w:style w:type="character" w:styleId="14">
     <w:name w:val="Hyperlink"/>
     <w:unhideWhenUsed/>
+    <w:qFormat/>
     <w:uiPriority w:val="99"/>
     <w:rPr>
       <w:color w:val="0563C1"/>
@@ -4451,6 +4510,7 @@
     <w:qFormat/>
     <w:uiPriority w:val="0"/>
     <w:rPr>
+      <w:rFonts w:asciiTheme="minorHAnsi" w:hAnsiTheme="minorHAnsi" w:eastAsiaTheme="minorEastAsia" w:cstheme="minorBidi"/>
       <w:sz w:val="56"/>
       <w:szCs w:val="56"/>
     </w:rPr>
@@ -4460,6 +4520,7 @@
     <w:qFormat/>
     <w:uiPriority w:val="0"/>
     <w:rPr>
+      <w:rFonts w:asciiTheme="minorHAnsi" w:hAnsiTheme="minorHAnsi" w:eastAsiaTheme="minorEastAsia" w:cstheme="minorBidi"/>
       <w:sz w:val="21"/>
       <w:szCs w:val="22"/>
     </w:rPr>

</xml_diff>